<commit_message>
Over-write the existing files with update QR code
</commit_message>
<xml_diff>
--- a/MarshmallowBotInstructions_NoShooter.docx
+++ b/MarshmallowBotInstructions_NoShooter.docx
@@ -39,7 +39,15 @@
     </w:p>
     <w:p>
       <w:r>
-        <w:t>Step 2:  Make sure your motors are all plugged in the right spots the right way.  Before you power on the bot, make sure the three connectors to each fo the three servos (motors) are connected as shown below. Note the color code of the wires and the locations of the three connectors.  The left drive motor connec</w:t>
+        <w:t xml:space="preserve">Step 2:  Make sure your motors are all plugged in the right spots the right way.  Before you power on the bot, make sure the three connectors to each </w:t>
+      </w:r>
+      <w:proofErr w:type="spellStart"/>
+      <w:r>
+        <w:t>fo</w:t>
+      </w:r>
+      <w:proofErr w:type="spellEnd"/>
+      <w:r>
+        <w:t xml:space="preserve"> the three servos (motors) are connected as shown below. Note the color code of the wires and the locations of the three connectors.  The left drive motor connec</w:t>
       </w:r>
       <w:r>
         <w:t>ts as shown below:</w:t>
@@ -276,7 +284,15 @@
         <w:t>board.</w:t>
       </w:r>
       <w:r>
-        <w:t xml:space="preserve"> (we are working on a pcb design that will solve this problem)</w:t>
+        <w:t xml:space="preserve"> (we are working on a </w:t>
+      </w:r>
+      <w:proofErr w:type="spellStart"/>
+      <w:r>
+        <w:t>pcb</w:t>
+      </w:r>
+      <w:proofErr w:type="spellEnd"/>
+      <w:r>
+        <w:t xml:space="preserve"> design that will solve this problem)</w:t>
       </w:r>
     </w:p>
     <w:p>
@@ -341,15 +357,44 @@
         <w:t xml:space="preserve"> </w:t>
       </w:r>
       <w:r>
-        <w:t>5:  With the board powered on you will need to connect to it as a hot spot.  By default the wifi SSID is "MarshMallowBot" but it may be customized.  Use a computer, phone or tablet to connect to the wifi hotspot.  It will not provide internet, but</w:t>
+        <w:t xml:space="preserve">5:  With the board powered on you will need to connect to it as a hot spot.  By default the </w:t>
+      </w:r>
+      <w:proofErr w:type="spellStart"/>
+      <w:r>
+        <w:t>wifi</w:t>
+      </w:r>
+      <w:proofErr w:type="spellEnd"/>
+      <w:r>
+        <w:t xml:space="preserve"> SSID is "</w:t>
+      </w:r>
+      <w:proofErr w:type="spellStart"/>
+      <w:r>
+        <w:t>MarshMallowBot</w:t>
+      </w:r>
+      <w:proofErr w:type="spellEnd"/>
+      <w:r>
+        <w:t xml:space="preserve">" but it may be customized.  Use a computer, phone or tablet to connect to the </w:t>
+      </w:r>
+      <w:proofErr w:type="spellStart"/>
+      <w:r>
+        <w:t>wifi</w:t>
+      </w:r>
+      <w:proofErr w:type="spellEnd"/>
+      <w:r>
+        <w:t xml:space="preserve"> hotspot.  It will not provide internet, but</w:t>
       </w:r>
       <w:r>
         <w:t xml:space="preserve"> it will provide connection to the remote control.</w:t>
       </w:r>
     </w:p>
     <w:p>
-      <w:r>
-        <w:t>Wifi Password:  12345678</w:t>
+      <w:proofErr w:type="spellStart"/>
+      <w:r>
+        <w:t>Wifi</w:t>
+      </w:r>
+      <w:proofErr w:type="spellEnd"/>
+      <w:r>
+        <w:t xml:space="preserve"> Password:  12345678</w:t>
       </w:r>
     </w:p>
     <w:p>
@@ -371,7 +416,15 @@
     </w:p>
     <w:p>
       <w:r>
-        <w:t xml:space="preserve">Once you have this up you should be able to drive your marshmallowbot around and launch a mini marshmallow at your will. </w:t>
+        <w:t xml:space="preserve">Once you have this up you should be able to drive your </w:t>
+      </w:r>
+      <w:proofErr w:type="spellStart"/>
+      <w:r>
+        <w:t>marshmallowbot</w:t>
+      </w:r>
+      <w:proofErr w:type="spellEnd"/>
+      <w:r>
+        <w:t xml:space="preserve"> around and launch a mini marshmallow at your will. </w:t>
       </w:r>
     </w:p>
     <w:p>
@@ -382,7 +435,102 @@
         <w:t>Enjoy</w:t>
       </w:r>
     </w:p>
+    <w:p>
+      <w:pPr>
+        <w:jc w:val="center"/>
+      </w:pPr>
+    </w:p>
+    <w:p>
+      <w:pPr>
+        <w:jc w:val="center"/>
+      </w:pPr>
+    </w:p>
+    <w:p>
+      <w:r>
+        <w:t xml:space="preserve">If you want to duplicate, change, edit or understand your </w:t>
+      </w:r>
+      <w:proofErr w:type="spellStart"/>
+      <w:r>
+        <w:t>MarshmallowBot</w:t>
+      </w:r>
+      <w:proofErr w:type="spellEnd"/>
+      <w:r>
+        <w:t xml:space="preserve"> better, the files are stored in the </w:t>
+      </w:r>
+      <w:proofErr w:type="spellStart"/>
+      <w:r>
+        <w:t>respository</w:t>
+      </w:r>
+      <w:proofErr w:type="spellEnd"/>
+      <w:r>
+        <w:t xml:space="preserve"> via the QR code or at:  </w:t>
+      </w:r>
+      <w:hyperlink r:id="rId8" w:history="1">
+        <w:r>
+          <w:rPr>
+            <w:rStyle w:val="Hyperlink"/>
+          </w:rPr>
+          <w:t>https://github.com/bryceehill/MarshmallowBot</w:t>
+        </w:r>
+      </w:hyperlink>
+    </w:p>
     <w:p/>
+    <w:p>
+      <w:pPr>
+        <w:jc w:val="center"/>
+      </w:pPr>
+    </w:p>
+    <w:p>
+      <w:pPr>
+        <w:jc w:val="center"/>
+      </w:pPr>
+      <w:r>
+        <w:rPr>
+          <w:noProof/>
+        </w:rPr>
+        <w:drawing>
+          <wp:inline distT="0" distB="0" distL="0" distR="0" wp14:anchorId="1DA09301" wp14:editId="4A2018FA">
+            <wp:extent cx="2213811" cy="2213811"/>
+            <wp:effectExtent l="0" t="0" r="0" b="0"/>
+            <wp:docPr id="1" name="Picture 1"/>
+            <wp:cNvGraphicFramePr>
+              <a:graphicFrameLocks xmlns:a="http://schemas.openxmlformats.org/drawingml/2006/main" noChangeAspect="1"/>
+            </wp:cNvGraphicFramePr>
+            <a:graphic xmlns:a="http://schemas.openxmlformats.org/drawingml/2006/main">
+              <a:graphicData uri="http://schemas.openxmlformats.org/drawingml/2006/picture">
+                <pic:pic xmlns:pic="http://schemas.openxmlformats.org/drawingml/2006/picture">
+                  <pic:nvPicPr>
+                    <pic:cNvPr id="1" name="Picture 1"/>
+                    <pic:cNvPicPr/>
+                  </pic:nvPicPr>
+                  <pic:blipFill>
+                    <a:blip r:embed="rId9" cstate="print">
+                      <a:extLst>
+                        <a:ext uri="{28A0092B-C50C-407E-A947-70E740481C1C}">
+                          <a14:useLocalDpi xmlns:a14="http://schemas.microsoft.com/office/drawing/2010/main" val="0"/>
+                        </a:ext>
+                      </a:extLst>
+                    </a:blip>
+                    <a:stretch>
+                      <a:fillRect/>
+                    </a:stretch>
+                  </pic:blipFill>
+                  <pic:spPr>
+                    <a:xfrm>
+                      <a:off x="0" y="0"/>
+                      <a:ext cx="2216748" cy="2216748"/>
+                    </a:xfrm>
+                    <a:prstGeom prst="rect">
+                      <a:avLst/>
+                    </a:prstGeom>
+                  </pic:spPr>
+                </pic:pic>
+              </a:graphicData>
+            </a:graphic>
+          </wp:inline>
+        </w:drawing>
+      </w:r>
+    </w:p>
     <w:sectPr>
       <w:pgSz w:w="12240" w:h="15840"/>
       <w:pgMar w:top="1440" w:right="1440" w:bottom="1440" w:left="1440" w:header="720" w:footer="720" w:gutter="0"/>
@@ -819,6 +967,29 @@
     <w:semiHidden/>
     <w:unhideWhenUsed/>
   </w:style>
+  <w:style w:type="character" w:styleId="Hyperlink">
+    <w:name w:val="Hyperlink"/>
+    <w:basedOn w:val="DefaultParagraphFont"/>
+    <w:uiPriority w:val="99"/>
+    <w:unhideWhenUsed/>
+    <w:rsid w:val="00BB50A2"/>
+    <w:rPr>
+      <w:color w:val="467886" w:themeColor="hyperlink"/>
+      <w:u w:val="single"/>
+    </w:rPr>
+  </w:style>
+  <w:style w:type="character" w:styleId="UnresolvedMention">
+    <w:name w:val="Unresolved Mention"/>
+    <w:basedOn w:val="DefaultParagraphFont"/>
+    <w:uiPriority w:val="99"/>
+    <w:semiHidden/>
+    <w:unhideWhenUsed/>
+    <w:rsid w:val="00BB50A2"/>
+    <w:rPr>
+      <w:color w:val="605E5C"/>
+      <w:shd w:val="clear" w:color="auto" w:fill="E1DFDD"/>
+    </w:rPr>
+  </w:style>
 </w:styles>
 </file>
 

</xml_diff>